<commit_message>
Agregar figuras de matrices de confusion combinadas e individuales para los 3 modelos principales
</commit_message>
<xml_diff>
--- a/reports/Articulo_Homicidios_Guayaquil.docx
+++ b/reports/Articulo_Homicidios_Guayaquil.docx
@@ -600,7 +600,7 @@
       <w:r>
         <w:drawing>
           <wp:inline xmlns:a="http://schemas.openxmlformats.org/drawingml/2006/main" xmlns:pic="http://schemas.openxmlformats.org/drawingml/2006/picture">
-            <wp:extent cx="5029200" cy="11315700"/>
+            <wp:extent cx="5029200" cy="4780844"/>
             <wp:docPr id="1" name="Picture 1"/>
             <wp:cNvGraphicFramePr>
               <a:graphicFrameLocks noChangeAspect="1"/>
@@ -621,7 +621,7 @@
                   <pic:spPr>
                     <a:xfrm>
                       <a:off x="0" y="0"/>
-                      <a:ext cx="5029200" cy="11315700"/>
+                      <a:ext cx="5029200" cy="4780844"/>
                     </a:xfrm>
                     <a:prstGeom prst="rect"/>
                   </pic:spPr>

</xml_diff>